<commit_message>
I filled in my name, student ID number and the CW2 submission deadline.
</commit_message>
<xml_diff>
--- a/MATLAB_Coursework 2 _Word_Template.docx
+++ b/MATLAB_Coursework 2 _Word_Template.docx
@@ -186,7 +186,7 @@
     <w:sdtPr>
       <w:id w:val="1214853255"/>
       <w:docPartObj>
-        <w:docPartGallery w:val="AutoText"/>
+        <w:docPartGallery w:val="autotext"/>
       </w:docPartObj>
     </w:sdtPr>
     <w:sdtContent>
@@ -668,7 +668,7 @@
     <w:lsdException w:uiPriority="99" w:name="index 8"/>
     <w:lsdException w:uiPriority="99" w:name="index 9"/>
     <w:lsdException w:uiPriority="39" w:semiHidden="0" w:name="toc 1"/>
-    <w:lsdException w:uiPriority="39" w:semiHidden="0" w:name="toc 2"/>
+    <w:lsdException w:qFormat="1" w:uiPriority="39" w:semiHidden="0" w:name="toc 2"/>
     <w:lsdException w:uiPriority="39" w:name="toc 3"/>
     <w:lsdException w:uiPriority="39" w:name="toc 4"/>
     <w:lsdException w:uiPriority="39" w:name="toc 5"/>
@@ -679,8 +679,8 @@
     <w:lsdException w:uiPriority="99" w:name="Normal Indent"/>
     <w:lsdException w:uiPriority="99" w:name="footnote text"/>
     <w:lsdException w:uiPriority="99" w:name="annotation text"/>
-    <w:lsdException w:uiPriority="99" w:semiHidden="0" w:name="header"/>
-    <w:lsdException w:uiPriority="99" w:semiHidden="0" w:name="footer"/>
+    <w:lsdException w:qFormat="1" w:uiPriority="99" w:semiHidden="0" w:name="header"/>
+    <w:lsdException w:qFormat="1" w:uiPriority="99" w:semiHidden="0" w:name="footer"/>
     <w:lsdException w:uiPriority="99" w:name="index heading"/>
     <w:lsdException w:qFormat="1" w:uiPriority="35" w:semiHidden="0" w:name="caption"/>
     <w:lsdException w:uiPriority="99" w:name="table of figures"/>
@@ -713,7 +713,7 @@
     <w:lsdException w:qFormat="1" w:unhideWhenUsed="0" w:uiPriority="10" w:semiHidden="0" w:name="Title"/>
     <w:lsdException w:uiPriority="99" w:name="Closing"/>
     <w:lsdException w:uiPriority="99" w:name="Signature"/>
-    <w:lsdException w:uiPriority="1" w:name="Default Paragraph Font"/>
+    <w:lsdException w:qFormat="1" w:uiPriority="1" w:name="Default Paragraph Font"/>
     <w:lsdException w:uiPriority="99" w:name="Body Text"/>
     <w:lsdException w:uiPriority="99" w:name="Body Text Indent"/>
     <w:lsdException w:uiPriority="99" w:name="List Continue"/>
@@ -733,7 +733,7 @@
     <w:lsdException w:uiPriority="99" w:name="Body Text Indent 2"/>
     <w:lsdException w:uiPriority="99" w:name="Body Text Indent 3"/>
     <w:lsdException w:uiPriority="99" w:name="Block Text"/>
-    <w:lsdException w:uiPriority="99" w:semiHidden="0" w:name="Hyperlink"/>
+    <w:lsdException w:qFormat="1" w:uiPriority="99" w:semiHidden="0" w:name="Hyperlink"/>
     <w:lsdException w:uiPriority="99" w:name="FollowedHyperlink"/>
     <w:lsdException w:qFormat="1" w:unhideWhenUsed="0" w:uiPriority="22" w:semiHidden="0" w:name="Strong"/>
     <w:lsdException w:qFormat="1" w:unhideWhenUsed="0" w:uiPriority="20" w:semiHidden="0" w:name="Emphasis"/>
@@ -796,9 +796,9 @@
     <w:lsdException w:uiPriority="99" w:name="Table Web 2"/>
     <w:lsdException w:uiPriority="99" w:name="Table Web 3"/>
     <w:lsdException w:uiPriority="99" w:name="Balloon Text"/>
-    <w:lsdException w:unhideWhenUsed="0" w:uiPriority="39" w:semiHidden="0" w:name="Table Grid"/>
+    <w:lsdException w:qFormat="1" w:unhideWhenUsed="0" w:uiPriority="39" w:semiHidden="0" w:name="Table Grid"/>
     <w:lsdException w:uiPriority="99" w:name="Table Theme"/>
-    <w:lsdException w:unhideWhenUsed="0" w:uiPriority="99" w:name="Placeholder Text"/>
+    <w:lsdException w:qFormat="1" w:unhideWhenUsed="0" w:uiPriority="99" w:name="Placeholder Text"/>
     <w:lsdException w:unhideWhenUsed="0" w:uiPriority="60" w:semiHidden="0" w:name="Light Shading"/>
     <w:lsdException w:unhideWhenUsed="0" w:uiPriority="61" w:semiHidden="0" w:name="Light List"/>
     <w:lsdException w:unhideWhenUsed="0" w:uiPriority="62" w:semiHidden="0" w:name="Light Grid"/>
@@ -961,6 +961,7 @@
     <w:name w:val="Default Paragraph Font"/>
     <w:semiHidden/>
     <w:unhideWhenUsed/>
+    <w:qFormat/>
     <w:uiPriority w:val="1"/>
   </w:style>
   <w:style w:type="table" w:default="1" w:styleId="11">
@@ -1014,6 +1015,7 @@
     <w:basedOn w:val="1"/>
     <w:link w:val="17"/>
     <w:unhideWhenUsed/>
+    <w:qFormat/>
     <w:uiPriority w:val="99"/>
     <w:pPr>
       <w:tabs>
@@ -1028,6 +1030,7 @@
     <w:basedOn w:val="1"/>
     <w:link w:val="16"/>
     <w:unhideWhenUsed/>
+    <w:qFormat/>
     <w:uiPriority w:val="99"/>
     <w:pPr>
       <w:tabs>
@@ -1054,6 +1057,7 @@
     <w:next w:val="1"/>
     <w:autoRedefine/>
     <w:unhideWhenUsed/>
+    <w:qFormat/>
     <w:uiPriority w:val="39"/>
     <w:pPr>
       <w:spacing w:after="100"/>
@@ -1080,6 +1084,7 @@
   <w:style w:type="table" w:styleId="12">
     <w:name w:val="Table Grid"/>
     <w:basedOn w:val="11"/>
+    <w:qFormat/>
     <w:uiPriority w:val="39"/>
     <w:pPr>
       <w:spacing w:after="0" w:line="240" w:lineRule="auto"/>
@@ -1109,6 +1114,7 @@
     <w:name w:val="Hyperlink"/>
     <w:basedOn w:val="13"/>
     <w:unhideWhenUsed/>
+    <w:qFormat/>
     <w:uiPriority w:val="99"/>
     <w:rPr>
       <w:color w:val="0563C1" w:themeColor="hyperlink"/>
@@ -1130,12 +1136,14 @@
     <w:name w:val="Footer Char"/>
     <w:basedOn w:val="13"/>
     <w:link w:val="6"/>
+    <w:qFormat/>
     <w:uiPriority w:val="99"/>
   </w:style>
   <w:style w:type="character" w:customStyle="1" w:styleId="18">
     <w:name w:val="Title Char"/>
     <w:basedOn w:val="13"/>
     <w:link w:val="10"/>
+    <w:qFormat/>
     <w:uiPriority w:val="10"/>
     <w:rPr>
       <w:rFonts w:ascii="Arial" w:hAnsi="Arial" w:cs="Arial"/>
@@ -1149,6 +1157,7 @@
     <w:name w:val="Placeholder Text"/>
     <w:basedOn w:val="13"/>
     <w:semiHidden/>
+    <w:qFormat/>
     <w:uiPriority w:val="99"/>
     <w:rPr>
       <w:color w:val="808080"/>
@@ -1158,6 +1167,7 @@
     <w:name w:val="Heading 1 Char"/>
     <w:basedOn w:val="13"/>
     <w:link w:val="2"/>
+    <w:qFormat/>
     <w:uiPriority w:val="9"/>
     <w:rPr>
       <w:rFonts w:ascii="Arial" w:hAnsi="Arial" w:cs="Arial"/>
@@ -1171,6 +1181,7 @@
     <w:name w:val="Heading 2 Char"/>
     <w:basedOn w:val="13"/>
     <w:link w:val="4"/>
+    <w:qFormat/>
     <w:uiPriority w:val="9"/>
     <w:rPr>
       <w:rFonts w:ascii="Arial" w:hAnsi="Arial" w:cs="Arial"/>
@@ -1210,6 +1221,7 @@
     <w:basedOn w:val="1"/>
     <w:next w:val="1"/>
     <w:unhideWhenUsed/>
+    <w:qFormat/>
     <w:uiPriority w:val="37"/>
   </w:style>
   <w:style w:type="character" w:customStyle="1" w:styleId="24">

</xml_diff>

<commit_message>
Complete Task 1, temperature acquisition, plot and log file. And I have inserted the plot into the specified Word document and done some improvements.
</commit_message>
<xml_diff>
--- a/MATLAB_Coursework 2 _Word_Template.docx
+++ b/MATLAB_Coursework 2 _Word_Template.docx
@@ -92,8 +92,6 @@
         </w:rPr>
         <w:t>06 May 2026</w:t>
       </w:r>
-      <w:bookmarkStart w:id="0" w:name="_GoBack"/>
-      <w:bookmarkEnd w:id="0"/>
     </w:p>
     <w:p/>
     <w:p/>
@@ -114,24 +112,358 @@
     </w:p>
     <w:p>
       <w:pPr>
-        <w:rPr>
-          <w:color w:val="808080" w:themeColor="background1" w:themeShade="80"/>
-        </w:rPr>
-      </w:pPr>
-      <w:r>
-        <w:rPr>
-          <w:color w:val="808080" w:themeColor="background1" w:themeShade="80"/>
-        </w:rPr>
-        <w:t>For questions which require you to write text (i.e., descriptive sentences), or include images and graphs, please add them to the Word submission template.</w:t>
+        <w:spacing w:line="259" w:lineRule="auto"/>
+        <w:jc w:val="both"/>
+        <w:rPr>
+          <w:rFonts w:hint="eastAsia"/>
+          <w:color w:val="auto"/>
+          <w:sz w:val="22"/>
+          <w:szCs w:val="22"/>
+          <w:highlight w:val="none"/>
+        </w:rPr>
+      </w:pPr>
+      <w:r>
+        <w:rPr>
+          <w:rFonts w:hint="eastAsia"/>
+          <w:color w:val="auto"/>
+          <w:sz w:val="22"/>
+          <w:szCs w:val="22"/>
+          <w:highlight w:val="none"/>
+        </w:rPr>
+        <w:t>TASK 1-READ TEMPERATURE DATA,PLOT,AND WRITE TO A LOG FILE [20 MARKS]</w:t>
       </w:r>
     </w:p>
     <w:p>
       <w:pPr>
+        <w:keepNext w:val="0"/>
+        <w:keepLines w:val="0"/>
+        <w:widowControl/>
+        <w:suppressLineNumbers w:val="0"/>
+        <w:jc w:val="left"/>
+        <w:rPr>
+          <w:rFonts w:hint="eastAsia"/>
+          <w:color w:val="auto"/>
+          <w:sz w:val="22"/>
+          <w:szCs w:val="22"/>
+          <w:highlight w:val="none"/>
+        </w:rPr>
+      </w:pPr>
+      <w:r>
+        <w:rPr>
+          <w:rFonts w:hint="eastAsia" w:eastAsia="宋体"/>
+          <w:color w:val="000000" w:themeColor="text1"/>
+          <w:highlight w:val="none"/>
+          <w:lang w:val="en-US" w:eastAsia="zh-CN"/>
+          <w14:textFill>
+            <w14:solidFill>
+              <w14:schemeClr w14:val="tx1"/>
+            </w14:solidFill>
+          </w14:textFill>
+        </w:rPr>
+        <w:t>(a)</w:t>
+      </w:r>
+      <w:r>
+        <w:rPr>
+          <w:rFonts w:hint="eastAsia"/>
+          <w:color w:val="auto"/>
+          <w:sz w:val="22"/>
+          <w:szCs w:val="22"/>
+          <w:highlight w:val="none"/>
+          <w:lang w:val="en-US" w:eastAsia="zh-CN"/>
+        </w:rPr>
+        <w:t xml:space="preserve"> Include a photograph of the implementation by adding it to your Word template .docx file.</w:t>
+      </w:r>
+    </w:p>
+    <w:p>
+      <w:pPr>
         <w:spacing w:line="259" w:lineRule="auto"/>
         <w:jc w:val="both"/>
         <w:rPr>
+          <w:rFonts w:hint="default" w:eastAsia="宋体"/>
+          <w:color w:val="000000" w:themeColor="text1"/>
+          <w:highlight w:val="none"/>
+          <w:lang w:val="en-US" w:eastAsia="zh-CN"/>
+          <w14:textFill>
+            <w14:solidFill>
+              <w14:schemeClr w14:val="tx1"/>
+            </w14:solidFill>
+          </w14:textFill>
+        </w:rPr>
+      </w:pPr>
+      <w:r>
+        <w:rPr>
+          <w:rFonts w:hint="default" w:eastAsia="宋体"/>
           <w:color w:val="000000" w:themeColor="text1"/>
           <w:highlight w:val="cyan"/>
+          <w:lang w:val="en-US" w:eastAsia="zh-CN"/>
+          <w14:textFill>
+            <w14:solidFill>
+              <w14:schemeClr w14:val="tx1"/>
+            </w14:solidFill>
+          </w14:textFill>
+        </w:rPr>
+        <w:drawing>
+          <wp:inline distT="0" distB="0" distL="114300" distR="114300">
+            <wp:extent cx="2805430" cy="2103755"/>
+            <wp:effectExtent l="0" t="0" r="1270" b="4445"/>
+            <wp:docPr id="3" name="图片 3" descr="8806b1311d965d8a4b343a63a40ba627"/>
+            <wp:cNvGraphicFramePr>
+              <a:graphicFrameLocks xmlns:a="http://schemas.openxmlformats.org/drawingml/2006/main" noChangeAspect="1"/>
+            </wp:cNvGraphicFramePr>
+            <a:graphic xmlns:a="http://schemas.openxmlformats.org/drawingml/2006/main">
+              <a:graphicData uri="http://schemas.openxmlformats.org/drawingml/2006/picture">
+                <pic:pic xmlns:pic="http://schemas.openxmlformats.org/drawingml/2006/picture">
+                  <pic:nvPicPr>
+                    <pic:cNvPr id="3" name="图片 3" descr="8806b1311d965d8a4b343a63a40ba627"/>
+                    <pic:cNvPicPr>
+                      <a:picLocks noChangeAspect="1"/>
+                    </pic:cNvPicPr>
+                  </pic:nvPicPr>
+                  <pic:blipFill>
+                    <a:blip r:embed="rId10"/>
+                    <a:stretch>
+                      <a:fillRect/>
+                    </a:stretch>
+                  </pic:blipFill>
+                  <pic:spPr>
+                    <a:xfrm>
+                      <a:off x="0" y="0"/>
+                      <a:ext cx="2805430" cy="2103755"/>
+                    </a:xfrm>
+                    <a:prstGeom prst="rect">
+                      <a:avLst/>
+                    </a:prstGeom>
+                  </pic:spPr>
+                </pic:pic>
+              </a:graphicData>
+            </a:graphic>
+          </wp:inline>
+        </w:drawing>
+      </w:r>
+      <w:r>
+        <w:rPr>
+          <w:rFonts w:hint="default" w:eastAsia="宋体"/>
+          <w:color w:val="000000" w:themeColor="text1"/>
+          <w:highlight w:val="none"/>
+          <w:lang w:val="en-US" w:eastAsia="zh-CN"/>
+          <w14:textFill>
+            <w14:solidFill>
+              <w14:schemeClr w14:val="tx1"/>
+            </w14:solidFill>
+          </w14:textFill>
+        </w:rPr>
+        <w:drawing>
+          <wp:inline distT="0" distB="0" distL="114300" distR="114300">
+            <wp:extent cx="2821940" cy="2115820"/>
+            <wp:effectExtent l="0" t="0" r="10160" b="5080"/>
+            <wp:docPr id="2" name="图片 2" descr="c998a89b6a40d075b656ce76d66c14c3"/>
+            <wp:cNvGraphicFramePr>
+              <a:graphicFrameLocks xmlns:a="http://schemas.openxmlformats.org/drawingml/2006/main" noChangeAspect="1"/>
+            </wp:cNvGraphicFramePr>
+            <a:graphic xmlns:a="http://schemas.openxmlformats.org/drawingml/2006/main">
+              <a:graphicData uri="http://schemas.openxmlformats.org/drawingml/2006/picture">
+                <pic:pic xmlns:pic="http://schemas.openxmlformats.org/drawingml/2006/picture">
+                  <pic:nvPicPr>
+                    <pic:cNvPr id="2" name="图片 2" descr="c998a89b6a40d075b656ce76d66c14c3"/>
+                    <pic:cNvPicPr>
+                      <a:picLocks noChangeAspect="1"/>
+                    </pic:cNvPicPr>
+                  </pic:nvPicPr>
+                  <pic:blipFill>
+                    <a:blip r:embed="rId11"/>
+                    <a:stretch>
+                      <a:fillRect/>
+                    </a:stretch>
+                  </pic:blipFill>
+                  <pic:spPr>
+                    <a:xfrm>
+                      <a:off x="0" y="0"/>
+                      <a:ext cx="2821940" cy="2115820"/>
+                    </a:xfrm>
+                    <a:prstGeom prst="rect">
+                      <a:avLst/>
+                    </a:prstGeom>
+                  </pic:spPr>
+                </pic:pic>
+              </a:graphicData>
+            </a:graphic>
+          </wp:inline>
+        </w:drawing>
+      </w:r>
+    </w:p>
+    <w:p>
+      <w:pPr>
+        <w:spacing w:line="259" w:lineRule="auto"/>
+        <w:jc w:val="both"/>
+        <w:rPr>
+          <w:rFonts w:hint="default" w:eastAsia="宋体"/>
+          <w:color w:val="000000" w:themeColor="text1"/>
+          <w:highlight w:val="none"/>
+          <w:lang w:val="en-US" w:eastAsia="zh-CN"/>
+          <w14:textFill>
+            <w14:solidFill>
+              <w14:schemeClr w14:val="tx1"/>
+            </w14:solidFill>
+          </w14:textFill>
+        </w:rPr>
+      </w:pPr>
+    </w:p>
+    <w:p>
+      <w:pPr>
+        <w:keepNext w:val="0"/>
+        <w:keepLines w:val="0"/>
+        <w:widowControl/>
+        <w:suppressLineNumbers w:val="0"/>
+        <w:jc w:val="left"/>
+        <w:rPr>
+          <w:rFonts w:hint="eastAsia"/>
+          <w:color w:val="auto"/>
+          <w:sz w:val="22"/>
+          <w:szCs w:val="22"/>
+          <w:highlight w:val="none"/>
+          <w:lang w:val="en-US" w:eastAsia="zh-CN"/>
+        </w:rPr>
+      </w:pPr>
+      <w:r>
+        <w:rPr>
+          <w:rFonts w:hint="eastAsia" w:eastAsia="宋体"/>
+          <w:color w:val="000000" w:themeColor="text1"/>
+          <w:highlight w:val="none"/>
+          <w:lang w:val="en-US" w:eastAsia="zh-CN"/>
+          <w14:textFill>
+            <w14:solidFill>
+              <w14:schemeClr w14:val="tx1"/>
+            </w14:solidFill>
+          </w14:textFill>
+        </w:rPr>
+        <w:t xml:space="preserve">(c) </w:t>
+      </w:r>
+      <w:r>
+        <w:rPr>
+          <w:rFonts w:hint="eastAsia"/>
+          <w:color w:val="auto"/>
+          <w:sz w:val="22"/>
+          <w:szCs w:val="22"/>
+          <w:highlight w:val="none"/>
+          <w:lang w:val="en-US" w:eastAsia="zh-CN"/>
+        </w:rPr>
+        <w:t xml:space="preserve">Create a temperature/time plot and save the plot as an image and include it in my Word </w:t>
+      </w:r>
+    </w:p>
+    <w:p>
+      <w:pPr>
+        <w:keepNext w:val="0"/>
+        <w:keepLines w:val="0"/>
+        <w:widowControl/>
+        <w:suppressLineNumbers w:val="0"/>
+        <w:jc w:val="left"/>
+        <w:rPr>
+          <w:rFonts w:hint="default"/>
+          <w:color w:val="auto"/>
+          <w:sz w:val="22"/>
+          <w:szCs w:val="22"/>
+          <w:highlight w:val="none"/>
+          <w:lang w:val="en-US" w:eastAsia="zh-CN"/>
+        </w:rPr>
+      </w:pPr>
+      <w:r>
+        <w:rPr>
+          <w:rFonts w:hint="default"/>
+          <w:color w:val="auto"/>
+          <w:sz w:val="22"/>
+          <w:szCs w:val="22"/>
+          <w:highlight w:val="none"/>
+          <w:lang w:val="en-US" w:eastAsia="zh-CN"/>
+        </w:rPr>
+        <w:t>submission template.</w:t>
+      </w:r>
+    </w:p>
+    <w:p>
+      <w:pPr>
+        <w:keepNext w:val="0"/>
+        <w:keepLines w:val="0"/>
+        <w:widowControl/>
+        <w:suppressLineNumbers w:val="0"/>
+        <w:jc w:val="left"/>
+        <w:rPr>
+          <w:rFonts w:hint="eastAsia"/>
+          <w:color w:val="auto"/>
+          <w:sz w:val="22"/>
+          <w:szCs w:val="22"/>
+          <w:highlight w:val="none"/>
+          <w:lang w:val="en-US" w:eastAsia="zh-CN"/>
+        </w:rPr>
+      </w:pPr>
+      <w:r>
+        <w:rPr>
+          <w:rFonts w:hint="eastAsia"/>
+          <w:color w:val="auto"/>
+          <w:sz w:val="22"/>
+          <w:szCs w:val="22"/>
+          <w:highlight w:val="none"/>
+          <w:lang w:val="en-US" w:eastAsia="zh-CN"/>
+        </w:rPr>
+        <w:drawing>
+          <wp:inline distT="0" distB="0" distL="114300" distR="114300">
+            <wp:extent cx="5728335" cy="3751580"/>
+            <wp:effectExtent l="0" t="0" r="12065" b="7620"/>
+            <wp:docPr id="5" name="图片 5" descr="Capsule Temperature Acquisition Curve"/>
+            <wp:cNvGraphicFramePr>
+              <a:graphicFrameLocks xmlns:a="http://schemas.openxmlformats.org/drawingml/2006/main" noChangeAspect="1"/>
+            </wp:cNvGraphicFramePr>
+            <a:graphic xmlns:a="http://schemas.openxmlformats.org/drawingml/2006/main">
+              <a:graphicData uri="http://schemas.openxmlformats.org/drawingml/2006/picture">
+                <pic:pic xmlns:pic="http://schemas.openxmlformats.org/drawingml/2006/picture">
+                  <pic:nvPicPr>
+                    <pic:cNvPr id="5" name="图片 5" descr="Capsule Temperature Acquisition Curve"/>
+                    <pic:cNvPicPr>
+                      <a:picLocks noChangeAspect="1"/>
+                    </pic:cNvPicPr>
+                  </pic:nvPicPr>
+                  <pic:blipFill>
+                    <a:blip r:embed="rId12"/>
+                    <a:stretch>
+                      <a:fillRect/>
+                    </a:stretch>
+                  </pic:blipFill>
+                  <pic:spPr>
+                    <a:xfrm>
+                      <a:off x="0" y="0"/>
+                      <a:ext cx="5728335" cy="3751580"/>
+                    </a:xfrm>
+                    <a:prstGeom prst="rect">
+                      <a:avLst/>
+                    </a:prstGeom>
+                  </pic:spPr>
+                </pic:pic>
+              </a:graphicData>
+            </a:graphic>
+          </wp:inline>
+        </w:drawing>
+      </w:r>
+    </w:p>
+    <w:p>
+      <w:pPr>
+        <w:keepNext w:val="0"/>
+        <w:keepLines w:val="0"/>
+        <w:widowControl/>
+        <w:suppressLineNumbers w:val="0"/>
+        <w:jc w:val="left"/>
+        <w:rPr>
+          <w:rFonts w:hint="default"/>
+          <w:lang w:val="en-US"/>
+        </w:rPr>
+      </w:pPr>
+    </w:p>
+    <w:p>
+      <w:pPr>
+        <w:spacing w:line="259" w:lineRule="auto"/>
+        <w:jc w:val="both"/>
+        <w:rPr>
+          <w:rFonts w:hint="default" w:eastAsia="宋体"/>
+          <w:color w:val="000000" w:themeColor="text1"/>
+          <w:highlight w:val="none"/>
+          <w:lang w:val="en-US" w:eastAsia="zh-CN"/>
           <w14:textFill>
             <w14:solidFill>
               <w14:schemeClr w14:val="tx1"/>
@@ -147,6 +479,7 @@
       <w:footerReference r:id="rId7" w:type="default"/>
       <w:pgSz w:w="11906" w:h="16838"/>
       <w:pgMar w:top="1440" w:right="1440" w:bottom="1440" w:left="1440" w:header="850" w:footer="708" w:gutter="0"/>
+      <w:pgNumType w:fmt="decimal"/>
       <w:cols w:space="708" w:num="1"/>
       <w:titlePg/>
       <w:docGrid w:linePitch="360" w:charSpace="0"/>
@@ -182,128 +515,25 @@
 
 <file path=word/footer1.xml><?xml version="1.0" encoding="utf-8"?>
 <w:ftr xmlns:wpc="http://schemas.microsoft.com/office/word/2010/wordprocessingCanvas" xmlns:mc="http://schemas.openxmlformats.org/markup-compatibility/2006" xmlns:o="urn:schemas-microsoft-com:office:office" xmlns:r="http://schemas.openxmlformats.org/officeDocument/2006/relationships" xmlns:m="http://schemas.openxmlformats.org/officeDocument/2006/math" xmlns:v="urn:schemas-microsoft-com:vml" xmlns:wp14="http://schemas.microsoft.com/office/word/2010/wordprocessingDrawing" xmlns:wp="http://schemas.openxmlformats.org/drawingml/2006/wordprocessingDrawing" xmlns:w10="urn:schemas-microsoft-com:office:word" xmlns:w="http://schemas.openxmlformats.org/wordprocessingml/2006/main" xmlns:w14="http://schemas.microsoft.com/office/word/2010/wordml" xmlns:w15="http://schemas.microsoft.com/office/word/2012/wordml" xmlns:wpg="http://schemas.microsoft.com/office/word/2010/wordprocessingGroup" xmlns:wpi="http://schemas.microsoft.com/office/word/2010/wordprocessingInk" xmlns:wne="http://schemas.microsoft.com/office/word/2006/wordml" xmlns:wps="http://schemas.microsoft.com/office/word/2010/wordprocessingShape" xmlns:wpsCustomData="http://www.wps.cn/officeDocument/2013/wpsCustomData" mc:Ignorable="w14 w15 wp14">
-  <w:sdt>
-    <w:sdtPr>
-      <w:id w:val="1214853255"/>
-      <w:docPartObj>
-        <w:docPartGallery w:val="autotext"/>
-      </w:docPartObj>
-    </w:sdtPr>
-    <w:sdtContent>
-      <w:p>
-        <w:pPr>
-          <w:pStyle w:val="6"/>
-          <w:jc w:val="right"/>
-        </w:pPr>
-        <w:r>
-          <mc:AlternateContent>
-            <mc:Choice Requires="wps">
-              <w:drawing>
-                <wp:anchor distT="0" distB="0" distL="114300" distR="114300" simplePos="0" relativeHeight="251659264" behindDoc="0" locked="0" layoutInCell="1" allowOverlap="1">
-                  <wp:simplePos x="0" y="0"/>
-                  <wp:positionH relativeFrom="column">
-                    <wp:posOffset>-9525</wp:posOffset>
-                  </wp:positionH>
-                  <wp:positionV relativeFrom="paragraph">
-                    <wp:posOffset>-129540</wp:posOffset>
-                  </wp:positionV>
-                  <wp:extent cx="5781675" cy="0"/>
-                  <wp:effectExtent l="0" t="0" r="0" b="0"/>
-                  <wp:wrapNone/>
-                  <wp:docPr id="4" name="Straight Connector 4"/>
-                  <wp:cNvGraphicFramePr/>
-                  <a:graphic xmlns:a="http://schemas.openxmlformats.org/drawingml/2006/main">
-                    <a:graphicData uri="http://schemas.microsoft.com/office/word/2010/wordprocessingShape">
-                      <wps:wsp>
-                        <wps:cNvCnPr/>
-                        <wps:spPr>
-                          <a:xfrm>
-                            <a:off x="0" y="0"/>
-                            <a:ext cx="5781675" cy="0"/>
-                          </a:xfrm>
-                          <a:prstGeom prst="line">
-                            <a:avLst/>
-                          </a:prstGeom>
-                        </wps:spPr>
-                        <wps:style>
-                          <a:lnRef idx="1">
-                            <a:schemeClr val="accent1"/>
-                          </a:lnRef>
-                          <a:fillRef idx="0">
-                            <a:schemeClr val="accent1"/>
-                          </a:fillRef>
-                          <a:effectRef idx="0">
-                            <a:schemeClr val="accent1"/>
-                          </a:effectRef>
-                          <a:fontRef idx="minor">
-                            <a:schemeClr val="tx1"/>
-                          </a:fontRef>
-                        </wps:style>
-                        <wps:bodyPr/>
-                      </wps:wsp>
-                    </a:graphicData>
-                  </a:graphic>
-                </wp:anchor>
-              </w:drawing>
-            </mc:Choice>
-            <mc:Fallback>
-              <w:pict>
-                <v:line id="Straight Connector 4" o:spid="_x0000_s1026" o:spt="20" style="position:absolute;left:0pt;margin-left:-0.75pt;margin-top:-10.2pt;height:0pt;width:455.25pt;z-index:251659264;mso-width-relative:page;mso-height-relative:page;" filled="f" stroked="t" coordsize="21600,21600" o:gfxdata="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">
-                  <v:fill on="f" focussize="0,0"/>
-                  <v:stroke weight="0.5pt" color="#4472C4 [3204]" miterlimit="8" joinstyle="miter"/>
-                  <v:imagedata o:title=""/>
-                  <o:lock v:ext="edit" aspectratio="f"/>
-                </v:line>
-              </w:pict>
-            </mc:Fallback>
-          </mc:AlternateContent>
-        </w:r>
-        <w:r>
-          <w:fldChar w:fldCharType="begin"/>
-        </w:r>
-        <w:r>
-          <w:instrText xml:space="preserve"> PAGE   \* MERGEFORMAT </w:instrText>
-        </w:r>
-        <w:r>
-          <w:fldChar w:fldCharType="separate"/>
-        </w:r>
-        <w:r>
-          <w:t>2</w:t>
-        </w:r>
-        <w:r>
-          <w:fldChar w:fldCharType="end"/>
-        </w:r>
-      </w:p>
-    </w:sdtContent>
-  </w:sdt>
   <w:p>
     <w:pPr>
       <w:pStyle w:val="6"/>
       <w:rPr>
+        <w:rFonts w:hint="default" w:eastAsia="宋体"/>
         <w:i/>
         <w:iCs/>
         <w:sz w:val="18"/>
         <w:szCs w:val="18"/>
+        <w:lang w:val="en-US" w:eastAsia="zh-CN"/>
       </w:rPr>
     </w:pPr>
     <w:r>
       <w:rPr>
-        <w:i/>
-        <w:iCs/>
-        <w:sz w:val="18"/>
-        <w:szCs w:val="18"/>
-        <w:highlight w:val="yellow"/>
+        <w:rFonts w:hint="eastAsia" w:eastAsia="宋体"/>
+        <w:sz w:val="22"/>
+        <w:lang w:val="en-US" w:eastAsia="zh-CN"/>
       </w:rPr>
-      <w:t>Your name, student ID</w:t>
-    </w:r>
-    <w:r>
-      <w:rPr>
-        <w:i/>
-        <w:iCs/>
-        <w:sz w:val="18"/>
-        <w:szCs w:val="18"/>
-      </w:rPr>
-      <w:t xml:space="preserve"> </w:t>
+      <w:t>Haomiao Zhu, 20721147</w:t>
     </w:r>
   </w:p>
 </w:ftr>
@@ -373,6 +603,8 @@
       </w:rPr>
       <w:t>MATLAB Coursework 2</w:t>
     </w:r>
+    <w:bookmarkStart w:id="0" w:name="_GoBack"/>
+    <w:bookmarkEnd w:id="0"/>
   </w:p>
 </w:hdr>
 </file>
@@ -642,7 +874,7 @@
   <w:docDefaults>
     <w:rPrDefault>
       <w:rPr>
-        <w:rFonts w:asciiTheme="minorHAnsi" w:hAnsiTheme="minorHAnsi" w:eastAsiaTheme="minorHAnsi" w:cstheme="minorBidi"/>
+        <w:rFonts w:ascii="Times New Roman" w:hAnsi="Times New Roman" w:eastAsia="宋体" w:cs="Times New Roman"/>
       </w:rPr>
     </w:rPrDefault>
     <w:pPrDefault/>
@@ -667,7 +899,7 @@
     <w:lsdException w:uiPriority="99" w:name="index 7"/>
     <w:lsdException w:uiPriority="99" w:name="index 8"/>
     <w:lsdException w:uiPriority="99" w:name="index 9"/>
-    <w:lsdException w:uiPriority="39" w:semiHidden="0" w:name="toc 1"/>
+    <w:lsdException w:qFormat="1" w:uiPriority="39" w:semiHidden="0" w:name="toc 1"/>
     <w:lsdException w:qFormat="1" w:uiPriority="39" w:semiHidden="0" w:name="toc 2"/>
     <w:lsdException w:uiPriority="39" w:name="toc 3"/>
     <w:lsdException w:uiPriority="39" w:name="toc 4"/>
@@ -751,7 +983,7 @@
     <w:lsdException w:uiPriority="99" w:name="HTML Sample"/>
     <w:lsdException w:uiPriority="99" w:name="HTML Typewriter"/>
     <w:lsdException w:uiPriority="99" w:name="HTML Variable"/>
-    <w:lsdException w:uiPriority="99" w:name="Normal Table"/>
+    <w:lsdException w:qFormat="1" w:uiPriority="99" w:name="Normal Table"/>
     <w:lsdException w:uiPriority="99" w:name="annotation subject"/>
     <w:lsdException w:uiPriority="99" w:name="Table Simple 1"/>
     <w:lsdException w:uiPriority="99" w:name="Table Simple 2"/>
@@ -968,6 +1200,7 @@
     <w:name w:val="Normal Table"/>
     <w:semiHidden/>
     <w:unhideWhenUsed/>
+    <w:qFormat/>
     <w:uiPriority w:val="99"/>
     <w:tblPr>
       <w:tblCellMar>
@@ -1046,6 +1279,7 @@
     <w:next w:val="1"/>
     <w:autoRedefine/>
     <w:unhideWhenUsed/>
+    <w:qFormat/>
     <w:uiPriority w:val="39"/>
     <w:pPr>
       <w:spacing w:after="100"/>
@@ -1130,6 +1364,7 @@
     <w:name w:val="Header Char"/>
     <w:basedOn w:val="13"/>
     <w:link w:val="7"/>
+    <w:qFormat/>
     <w:uiPriority w:val="99"/>
   </w:style>
   <w:style w:type="character" w:customStyle="1" w:styleId="17">

</xml_diff>

<commit_message>
I have completed Task2, temp_monitor function with LED control. And I put all my images of my devices, flowcharts and the graph into my word document.
</commit_message>
<xml_diff>
--- a/MATLAB_Coursework 2 _Word_Template.docx
+++ b/MATLAB_Coursework 2 _Word_Template.docx
@@ -444,6 +444,87 @@
     </w:p>
     <w:p>
       <w:pPr>
+        <w:spacing w:line="259" w:lineRule="auto"/>
+        <w:jc w:val="both"/>
+        <w:rPr>
+          <w:rFonts w:hint="default"/>
+          <w:color w:val="auto"/>
+          <w:sz w:val="22"/>
+          <w:szCs w:val="22"/>
+          <w:highlight w:val="none"/>
+          <w:lang w:val="en-US"/>
+        </w:rPr>
+      </w:pPr>
+    </w:p>
+    <w:p>
+      <w:pPr>
+        <w:spacing w:line="259" w:lineRule="auto"/>
+        <w:jc w:val="both"/>
+        <w:rPr>
+          <w:rFonts w:hint="default"/>
+          <w:color w:val="auto"/>
+          <w:sz w:val="22"/>
+          <w:szCs w:val="22"/>
+          <w:highlight w:val="none"/>
+          <w:lang w:val="en-US"/>
+        </w:rPr>
+      </w:pPr>
+    </w:p>
+    <w:p>
+      <w:pPr>
+        <w:spacing w:line="259" w:lineRule="auto"/>
+        <w:jc w:val="both"/>
+        <w:rPr>
+          <w:rFonts w:hint="default"/>
+          <w:color w:val="auto"/>
+          <w:sz w:val="22"/>
+          <w:szCs w:val="22"/>
+          <w:highlight w:val="none"/>
+          <w:lang w:val="en-US"/>
+        </w:rPr>
+      </w:pPr>
+    </w:p>
+    <w:p>
+      <w:pPr>
+        <w:spacing w:line="259" w:lineRule="auto"/>
+        <w:jc w:val="both"/>
+        <w:rPr>
+          <w:rFonts w:hint="default"/>
+          <w:color w:val="auto"/>
+          <w:sz w:val="22"/>
+          <w:szCs w:val="22"/>
+          <w:highlight w:val="none"/>
+          <w:lang w:val="en-US"/>
+        </w:rPr>
+      </w:pPr>
+    </w:p>
+    <w:p>
+      <w:pPr>
+        <w:spacing w:line="259" w:lineRule="auto"/>
+        <w:jc w:val="both"/>
+        <w:rPr>
+          <w:rFonts w:hint="default"/>
+          <w:color w:val="auto"/>
+          <w:sz w:val="22"/>
+          <w:szCs w:val="22"/>
+          <w:highlight w:val="none"/>
+          <w:lang w:val="en-US"/>
+        </w:rPr>
+      </w:pPr>
+      <w:r>
+        <w:rPr>
+          <w:rFonts w:hint="default"/>
+          <w:color w:val="auto"/>
+          <w:sz w:val="22"/>
+          <w:szCs w:val="22"/>
+          <w:highlight w:val="none"/>
+          <w:lang w:val="en-US"/>
+        </w:rPr>
+        <w:t>TASK 2-LED TEMPERATURE MONITORING DEVICE IMPLEMENTATION [25 MARKS]</w:t>
+      </w:r>
+    </w:p>
+    <w:p>
+      <w:pPr>
         <w:keepNext w:val="0"/>
         <w:keepLines w:val="0"/>
         <w:widowControl/>
@@ -451,16 +532,265 @@
         <w:jc w:val="left"/>
         <w:rPr>
           <w:rFonts w:hint="default"/>
-          <w:lang w:val="en-US"/>
-        </w:rPr>
-      </w:pPr>
+          <w:color w:val="auto"/>
+          <w:sz w:val="22"/>
+          <w:szCs w:val="22"/>
+          <w:highlight w:val="none"/>
+          <w:lang w:val="en-US" w:eastAsia="zh-CN"/>
+        </w:rPr>
+      </w:pPr>
+      <w:r>
+        <w:rPr>
+          <w:rFonts w:hint="eastAsia"/>
+          <w:color w:val="auto"/>
+          <w:sz w:val="22"/>
+          <w:szCs w:val="22"/>
+          <w:highlight w:val="none"/>
+          <w:lang w:val="en-US" w:eastAsia="zh-CN"/>
+        </w:rPr>
+        <w:t xml:space="preserve">(f) Include a photograph of the implementation by adding it to </w:t>
+      </w:r>
+      <w:r>
+        <w:rPr>
+          <w:rFonts w:hint="default"/>
+          <w:color w:val="auto"/>
+          <w:sz w:val="22"/>
+          <w:szCs w:val="22"/>
+          <w:highlight w:val="none"/>
+          <w:lang w:val="en-US" w:eastAsia="zh-CN"/>
+        </w:rPr>
+        <w:t>your Word template .docx file</w:t>
+      </w:r>
+    </w:p>
+    <w:p>
+      <w:pPr>
+        <w:keepNext w:val="0"/>
+        <w:keepLines w:val="0"/>
+        <w:widowControl/>
+        <w:suppressLineNumbers w:val="0"/>
+        <w:jc w:val="left"/>
+        <w:rPr>
+          <w:rFonts w:hint="eastAsia"/>
+          <w:color w:val="auto"/>
+          <w:sz w:val="22"/>
+          <w:szCs w:val="22"/>
+          <w:highlight w:val="none"/>
+          <w:lang w:val="en-US" w:eastAsia="zh-CN"/>
+        </w:rPr>
+      </w:pPr>
+    </w:p>
+    <w:p>
+      <w:pPr>
+        <w:keepNext w:val="0"/>
+        <w:keepLines w:val="0"/>
+        <w:widowControl/>
+        <w:suppressLineNumbers w:val="0"/>
+        <w:jc w:val="left"/>
+        <w:rPr>
+          <w:rFonts w:hint="eastAsia"/>
+          <w:color w:val="auto"/>
+          <w:sz w:val="22"/>
+          <w:szCs w:val="22"/>
+          <w:highlight w:val="none"/>
+          <w:lang w:val="en-US" w:eastAsia="zh-CN"/>
+        </w:rPr>
+      </w:pPr>
+      <w:r>
+        <w:rPr>
+          <w:rFonts w:hint="eastAsia"/>
+          <w:color w:val="auto"/>
+          <w:sz w:val="22"/>
+          <w:szCs w:val="22"/>
+          <w:highlight w:val="none"/>
+          <w:lang w:val="en-US" w:eastAsia="zh-CN"/>
+        </w:rPr>
+        <w:drawing>
+          <wp:inline distT="0" distB="0" distL="114300" distR="114300">
+            <wp:extent cx="2108200" cy="2811780"/>
+            <wp:effectExtent l="0" t="0" r="7620" b="0"/>
+            <wp:docPr id="4" name="图片 4" descr="4ea239da3161b07575bc32bc72da3837"/>
+            <wp:cNvGraphicFramePr>
+              <a:graphicFrameLocks xmlns:a="http://schemas.openxmlformats.org/drawingml/2006/main" noChangeAspect="1"/>
+            </wp:cNvGraphicFramePr>
+            <a:graphic xmlns:a="http://schemas.openxmlformats.org/drawingml/2006/main">
+              <a:graphicData uri="http://schemas.openxmlformats.org/drawingml/2006/picture">
+                <pic:pic xmlns:pic="http://schemas.openxmlformats.org/drawingml/2006/picture">
+                  <pic:nvPicPr>
+                    <pic:cNvPr id="4" name="图片 4" descr="4ea239da3161b07575bc32bc72da3837"/>
+                    <pic:cNvPicPr>
+                      <a:picLocks noChangeAspect="1"/>
+                    </pic:cNvPicPr>
+                  </pic:nvPicPr>
+                  <pic:blipFill>
+                    <a:blip r:embed="rId13"/>
+                    <a:stretch>
+                      <a:fillRect/>
+                    </a:stretch>
+                  </pic:blipFill>
+                  <pic:spPr>
+                    <a:xfrm rot="16200000">
+                      <a:off x="0" y="0"/>
+                      <a:ext cx="2108200" cy="2811780"/>
+                    </a:xfrm>
+                    <a:prstGeom prst="rect">
+                      <a:avLst/>
+                    </a:prstGeom>
+                  </pic:spPr>
+                </pic:pic>
+              </a:graphicData>
+            </a:graphic>
+          </wp:inline>
+        </w:drawing>
+      </w:r>
+      <w:r>
+        <w:rPr>
+          <w:rFonts w:hint="eastAsia"/>
+          <w:color w:val="auto"/>
+          <w:sz w:val="22"/>
+          <w:szCs w:val="22"/>
+          <w:highlight w:val="none"/>
+          <w:lang w:val="en-US" w:eastAsia="zh-CN"/>
+        </w:rPr>
+        <w:drawing>
+          <wp:inline distT="0" distB="0" distL="114300" distR="114300">
+            <wp:extent cx="2814320" cy="2110740"/>
+            <wp:effectExtent l="0" t="0" r="5080" b="10160"/>
+            <wp:docPr id="6" name="图片 6" descr="1d443d259bbe539c2e33a13e7e74a5f6"/>
+            <wp:cNvGraphicFramePr>
+              <a:graphicFrameLocks xmlns:a="http://schemas.openxmlformats.org/drawingml/2006/main" noChangeAspect="1"/>
+            </wp:cNvGraphicFramePr>
+            <a:graphic xmlns:a="http://schemas.openxmlformats.org/drawingml/2006/main">
+              <a:graphicData uri="http://schemas.openxmlformats.org/drawingml/2006/picture">
+                <pic:pic xmlns:pic="http://schemas.openxmlformats.org/drawingml/2006/picture">
+                  <pic:nvPicPr>
+                    <pic:cNvPr id="6" name="图片 6" descr="1d443d259bbe539c2e33a13e7e74a5f6"/>
+                    <pic:cNvPicPr>
+                      <a:picLocks noChangeAspect="1"/>
+                    </pic:cNvPicPr>
+                  </pic:nvPicPr>
+                  <pic:blipFill>
+                    <a:blip r:embed="rId14"/>
+                    <a:stretch>
+                      <a:fillRect/>
+                    </a:stretch>
+                  </pic:blipFill>
+                  <pic:spPr>
+                    <a:xfrm>
+                      <a:off x="0" y="0"/>
+                      <a:ext cx="2814320" cy="2110740"/>
+                    </a:xfrm>
+                    <a:prstGeom prst="rect">
+                      <a:avLst/>
+                    </a:prstGeom>
+                  </pic:spPr>
+                </pic:pic>
+              </a:graphicData>
+            </a:graphic>
+          </wp:inline>
+        </w:drawing>
+      </w:r>
+    </w:p>
+    <w:p>
+      <w:pPr>
+        <w:bidi w:val="0"/>
+        <w:jc w:val="left"/>
+        <w:rPr>
+          <w:rFonts w:hint="default" w:ascii="Arial" w:hAnsi="Arial" w:cs="Arial" w:eastAsiaTheme="minorHAnsi"/>
+          <w:sz w:val="22"/>
+          <w:szCs w:val="22"/>
+          <w:lang w:val="en-US" w:eastAsia="zh-CN" w:bidi="ar-SA"/>
+        </w:rPr>
+      </w:pPr>
+      <w:r>
+        <w:rPr>
+          <w:rFonts w:hint="eastAsia" w:cs="Arial"/>
+          <w:sz w:val="22"/>
+          <w:szCs w:val="22"/>
+          <w:lang w:val="en-US" w:eastAsia="zh-CN" w:bidi="ar-SA"/>
+        </w:rPr>
+        <w:t>(g)</w:t>
+      </w:r>
+    </w:p>
+    <w:p>
+      <w:pPr>
+        <w:keepNext w:val="0"/>
+        <w:keepLines w:val="0"/>
+        <w:widowControl/>
+        <w:suppressLineNumbers w:val="0"/>
+        <w:jc w:val="left"/>
+        <w:rPr>
+          <w:rFonts w:hint="default"/>
+          <w:color w:val="auto"/>
+          <w:sz w:val="22"/>
+          <w:szCs w:val="22"/>
+          <w:highlight w:val="none"/>
+          <w:lang w:val="en-US" w:eastAsia="zh-CN"/>
+        </w:rPr>
+      </w:pPr>
+      <w:r>
+        <w:rPr>
+          <w:rFonts w:hint="default"/>
+          <w:color w:val="auto"/>
+          <w:sz w:val="22"/>
+          <w:szCs w:val="22"/>
+          <w:highlight w:val="none"/>
+          <w:lang w:val="en-US" w:eastAsia="zh-CN"/>
+        </w:rPr>
+        <w:drawing>
+          <wp:inline distT="0" distB="0" distL="114300" distR="114300">
+            <wp:extent cx="4556125" cy="5078095"/>
+            <wp:effectExtent l="0" t="0" r="3175" b="1905"/>
+            <wp:docPr id="9" name="图片 9" descr="T(2)(g) The flowchart before coding"/>
+            <wp:cNvGraphicFramePr>
+              <a:graphicFrameLocks xmlns:a="http://schemas.openxmlformats.org/drawingml/2006/main" noChangeAspect="1"/>
+            </wp:cNvGraphicFramePr>
+            <a:graphic xmlns:a="http://schemas.openxmlformats.org/drawingml/2006/main">
+              <a:graphicData uri="http://schemas.openxmlformats.org/drawingml/2006/picture">
+                <pic:pic xmlns:pic="http://schemas.openxmlformats.org/drawingml/2006/picture">
+                  <pic:nvPicPr>
+                    <pic:cNvPr id="9" name="图片 9" descr="T(2)(g) The flowchart before coding"/>
+                    <pic:cNvPicPr>
+                      <a:picLocks noChangeAspect="1"/>
+                    </pic:cNvPicPr>
+                  </pic:nvPicPr>
+                  <pic:blipFill>
+                    <a:blip r:embed="rId15"/>
+                    <a:stretch>
+                      <a:fillRect/>
+                    </a:stretch>
+                  </pic:blipFill>
+                  <pic:spPr>
+                    <a:xfrm>
+                      <a:off x="0" y="0"/>
+                      <a:ext cx="4556125" cy="5078095"/>
+                    </a:xfrm>
+                    <a:prstGeom prst="rect">
+                      <a:avLst/>
+                    </a:prstGeom>
+                  </pic:spPr>
+                </pic:pic>
+              </a:graphicData>
+            </a:graphic>
+          </wp:inline>
+        </w:drawing>
+      </w:r>
     </w:p>
     <w:p>
       <w:pPr>
         <w:spacing w:line="259" w:lineRule="auto"/>
         <w:jc w:val="both"/>
         <w:rPr>
-          <w:rFonts w:hint="default" w:eastAsia="宋体"/>
+          <w:rFonts w:hint="eastAsia"/>
+          <w:color w:val="auto"/>
+          <w:sz w:val="22"/>
+          <w:szCs w:val="22"/>
+          <w:highlight w:val="none"/>
+          <w:lang w:val="en-US" w:eastAsia="zh-CN"/>
+        </w:rPr>
+      </w:pPr>
+      <w:r>
+        <w:rPr>
+          <w:rFonts w:hint="eastAsia" w:eastAsia="宋体"/>
           <w:color w:val="000000" w:themeColor="text1"/>
           <w:highlight w:val="none"/>
           <w:lang w:val="en-US" w:eastAsia="zh-CN"/>
@@ -470,7 +800,164 @@
             </w14:solidFill>
           </w14:textFill>
         </w:rPr>
-      </w:pPr>
+        <w:t xml:space="preserve">(i) </w:t>
+      </w:r>
+      <w:r>
+        <w:rPr>
+          <w:rFonts w:hint="eastAsia"/>
+          <w:color w:val="auto"/>
+          <w:sz w:val="22"/>
+          <w:szCs w:val="22"/>
+          <w:highlight w:val="none"/>
+          <w:lang w:val="en-US" w:eastAsia="zh-CN"/>
+        </w:rPr>
+        <w:t>Save a snapshot of the plot as an image and include it in your .docx template.</w:t>
+      </w:r>
+    </w:p>
+    <w:p>
+      <w:pPr>
+        <w:spacing w:line="259" w:lineRule="auto"/>
+        <w:jc w:val="both"/>
+        <w:rPr>
+          <w:rFonts w:hint="default"/>
+          <w:color w:val="auto"/>
+          <w:sz w:val="22"/>
+          <w:szCs w:val="22"/>
+          <w:highlight w:val="none"/>
+          <w:lang w:val="en-US" w:eastAsia="zh-CN"/>
+        </w:rPr>
+      </w:pPr>
+      <w:r>
+        <w:rPr>
+          <w:rFonts w:hint="default"/>
+          <w:color w:val="auto"/>
+          <w:sz w:val="22"/>
+          <w:szCs w:val="22"/>
+          <w:highlight w:val="none"/>
+          <w:lang w:val="en-US" w:eastAsia="zh-CN"/>
+        </w:rPr>
+        <w:drawing>
+          <wp:inline distT="0" distB="0" distL="114300" distR="114300">
+            <wp:extent cx="5721985" cy="3158490"/>
+            <wp:effectExtent l="0" t="0" r="5715" b="3810"/>
+            <wp:docPr id="8" name="图片 8" descr="Real-Time Temperature Monitoring Curve"/>
+            <wp:cNvGraphicFramePr>
+              <a:graphicFrameLocks xmlns:a="http://schemas.openxmlformats.org/drawingml/2006/main" noChangeAspect="1"/>
+            </wp:cNvGraphicFramePr>
+            <a:graphic xmlns:a="http://schemas.openxmlformats.org/drawingml/2006/main">
+              <a:graphicData uri="http://schemas.openxmlformats.org/drawingml/2006/picture">
+                <pic:pic xmlns:pic="http://schemas.openxmlformats.org/drawingml/2006/picture">
+                  <pic:nvPicPr>
+                    <pic:cNvPr id="8" name="图片 8" descr="Real-Time Temperature Monitoring Curve"/>
+                    <pic:cNvPicPr>
+                      <a:picLocks noChangeAspect="1"/>
+                    </pic:cNvPicPr>
+                  </pic:nvPicPr>
+                  <pic:blipFill>
+                    <a:blip r:embed="rId16"/>
+                    <a:stretch>
+                      <a:fillRect/>
+                    </a:stretch>
+                  </pic:blipFill>
+                  <pic:spPr>
+                    <a:xfrm>
+                      <a:off x="0" y="0"/>
+                      <a:ext cx="5721985" cy="3158490"/>
+                    </a:xfrm>
+                    <a:prstGeom prst="rect">
+                      <a:avLst/>
+                    </a:prstGeom>
+                  </pic:spPr>
+                </pic:pic>
+              </a:graphicData>
+            </a:graphic>
+          </wp:inline>
+        </w:drawing>
+      </w:r>
+    </w:p>
+    <w:p>
+      <w:pPr>
+        <w:spacing w:line="259" w:lineRule="auto"/>
+        <w:jc w:val="both"/>
+        <w:rPr>
+          <w:rFonts w:hint="eastAsia"/>
+          <w:color w:val="auto"/>
+          <w:sz w:val="22"/>
+          <w:szCs w:val="22"/>
+          <w:highlight w:val="none"/>
+          <w:lang w:val="en-US" w:eastAsia="zh-CN"/>
+        </w:rPr>
+      </w:pPr>
+      <w:r>
+        <w:rPr>
+          <w:rFonts w:hint="eastAsia"/>
+          <w:color w:val="auto"/>
+          <w:sz w:val="22"/>
+          <w:szCs w:val="22"/>
+          <w:highlight w:val="none"/>
+          <w:lang w:val="en-US" w:eastAsia="zh-CN"/>
+        </w:rPr>
+        <w:t>(m)</w:t>
+      </w:r>
+    </w:p>
+    <w:p>
+      <w:pPr>
+        <w:spacing w:line="259" w:lineRule="auto"/>
+        <w:jc w:val="both"/>
+        <w:rPr>
+          <w:rFonts w:hint="default"/>
+          <w:color w:val="auto"/>
+          <w:sz w:val="22"/>
+          <w:szCs w:val="22"/>
+          <w:highlight w:val="none"/>
+          <w:lang w:val="en-US" w:eastAsia="zh-CN"/>
+        </w:rPr>
+      </w:pPr>
+      <w:bookmarkStart w:id="0" w:name="_GoBack"/>
+      <w:r>
+        <w:drawing>
+          <wp:inline distT="0" distB="0" distL="114300" distR="114300">
+            <wp:extent cx="4777105" cy="4912360"/>
+            <wp:effectExtent l="0" t="0" r="10795" b="2540"/>
+            <wp:docPr id="10" name="图片 2"/>
+            <wp:cNvGraphicFramePr>
+              <a:graphicFrameLocks xmlns:a="http://schemas.openxmlformats.org/drawingml/2006/main" noChangeAspect="1"/>
+            </wp:cNvGraphicFramePr>
+            <a:graphic xmlns:a="http://schemas.openxmlformats.org/drawingml/2006/main">
+              <a:graphicData uri="http://schemas.openxmlformats.org/drawingml/2006/picture">
+                <pic:pic xmlns:pic="http://schemas.openxmlformats.org/drawingml/2006/picture">
+                  <pic:nvPicPr>
+                    <pic:cNvPr id="10" name="图片 2"/>
+                    <pic:cNvPicPr>
+                      <a:picLocks noChangeAspect="1"/>
+                    </pic:cNvPicPr>
+                  </pic:nvPicPr>
+                  <pic:blipFill>
+                    <a:blip r:embed="rId17"/>
+                    <a:stretch>
+                      <a:fillRect/>
+                    </a:stretch>
+                  </pic:blipFill>
+                  <pic:spPr>
+                    <a:xfrm>
+                      <a:off x="0" y="0"/>
+                      <a:ext cx="4777105" cy="4912360"/>
+                    </a:xfrm>
+                    <a:prstGeom prst="rect">
+                      <a:avLst/>
+                    </a:prstGeom>
+                    <a:noFill/>
+                    <a:ln>
+                      <a:noFill/>
+                    </a:ln>
+                  </pic:spPr>
+                </pic:pic>
+              </a:graphicData>
+            </a:graphic>
+          </wp:inline>
+        </w:drawing>
+      </w:r>
+      <w:bookmarkEnd w:id="0"/>
     </w:p>
     <w:sectPr>
       <w:headerReference r:id="rId6" w:type="first"/>
@@ -603,8 +1090,6 @@
       </w:rPr>
       <w:t>MATLAB Coursework 2</w:t>
     </w:r>
-    <w:bookmarkStart w:id="0" w:name="_GoBack"/>
-    <w:bookmarkEnd w:id="0"/>
   </w:p>
 </w:hdr>
 </file>

</xml_diff>

<commit_message>
I have completed Task3, temp_prediction function with rate calculation and Task 4. I put the flowchart into my Word document. Github is really hard to connect.
</commit_message>
<xml_diff>
--- a/MATLAB_Coursework 2 _Word_Template.docx
+++ b/MATLAB_Coursework 2 _Word_Template.docx
@@ -904,16 +904,7 @@
       <w:pPr>
         <w:spacing w:line="259" w:lineRule="auto"/>
         <w:jc w:val="both"/>
-        <w:rPr>
-          <w:rFonts w:hint="default"/>
-          <w:color w:val="auto"/>
-          <w:sz w:val="22"/>
-          <w:szCs w:val="22"/>
-          <w:highlight w:val="none"/>
-          <w:lang w:val="en-US" w:eastAsia="zh-CN"/>
-        </w:rPr>
-      </w:pPr>
-      <w:bookmarkStart w:id="0" w:name="_GoBack"/>
+      </w:pPr>
       <w:r>
         <w:drawing>
           <wp:inline distT="0" distB="0" distL="114300" distR="114300">
@@ -942,6 +933,108 @@
                     <a:xfrm>
                       <a:off x="0" y="0"/>
                       <a:ext cx="4777105" cy="4912360"/>
+                    </a:xfrm>
+                    <a:prstGeom prst="rect">
+                      <a:avLst/>
+                    </a:prstGeom>
+                    <a:noFill/>
+                    <a:ln>
+                      <a:noFill/>
+                    </a:ln>
+                  </pic:spPr>
+                </pic:pic>
+              </a:graphicData>
+            </a:graphic>
+          </wp:inline>
+        </w:drawing>
+      </w:r>
+    </w:p>
+    <w:p>
+      <w:pPr>
+        <w:spacing w:line="259" w:lineRule="auto"/>
+        <w:jc w:val="both"/>
+        <w:rPr>
+          <w:rFonts w:hint="eastAsia"/>
+          <w:lang w:val="en-US" w:eastAsia="zh-CN"/>
+        </w:rPr>
+      </w:pPr>
+      <w:r>
+        <w:rPr>
+          <w:rFonts w:hint="eastAsia"/>
+          <w:lang w:val="en-US" w:eastAsia="zh-CN"/>
+        </w:rPr>
+        <w:t>T</w:t>
+      </w:r>
+      <w:r>
+        <w:rPr>
+          <w:rFonts w:hint="default"/>
+          <w:lang w:val="en-US" w:eastAsia="zh-CN"/>
+        </w:rPr>
+        <w:t>ASK 3 – ALGORITHMS – TEMPERATURE PREDICTION [30 MARK</w:t>
+      </w:r>
+      <w:r>
+        <w:rPr>
+          <w:rFonts w:hint="eastAsia"/>
+          <w:lang w:val="en-US" w:eastAsia="zh-CN"/>
+        </w:rPr>
+        <w:t>S]</w:t>
+      </w:r>
+    </w:p>
+    <w:p>
+      <w:pPr>
+        <w:spacing w:line="259" w:lineRule="auto"/>
+        <w:jc w:val="both"/>
+        <w:rPr>
+          <w:rFonts w:hint="eastAsia"/>
+          <w:lang w:val="en-US" w:eastAsia="zh-CN"/>
+        </w:rPr>
+      </w:pPr>
+      <w:r>
+        <w:rPr>
+          <w:rFonts w:hint="eastAsia"/>
+          <w:lang w:val="en-US" w:eastAsia="zh-CN"/>
+        </w:rPr>
+        <w:t xml:space="preserve">(a) </w:t>
+      </w:r>
+    </w:p>
+    <w:p>
+      <w:pPr>
+        <w:spacing w:line="259" w:lineRule="auto"/>
+        <w:jc w:val="both"/>
+        <w:rPr>
+          <w:rFonts w:hint="default"/>
+          <w:lang w:val="en-US" w:eastAsia="zh-CN"/>
+        </w:rPr>
+      </w:pPr>
+      <w:bookmarkStart w:id="0" w:name="_GoBack"/>
+      <w:r>
+        <w:drawing>
+          <wp:inline distT="0" distB="0" distL="114300" distR="114300">
+            <wp:extent cx="6386830" cy="6036945"/>
+            <wp:effectExtent l="0" t="0" r="1270" b="8255"/>
+            <wp:docPr id="7" name="图片 1"/>
+            <wp:cNvGraphicFramePr>
+              <a:graphicFrameLocks xmlns:a="http://schemas.openxmlformats.org/drawingml/2006/main" noChangeAspect="1"/>
+            </wp:cNvGraphicFramePr>
+            <a:graphic xmlns:a="http://schemas.openxmlformats.org/drawingml/2006/main">
+              <a:graphicData uri="http://schemas.openxmlformats.org/drawingml/2006/picture">
+                <pic:pic xmlns:pic="http://schemas.openxmlformats.org/drawingml/2006/picture">
+                  <pic:nvPicPr>
+                    <pic:cNvPr id="7" name="图片 1"/>
+                    <pic:cNvPicPr>
+                      <a:picLocks noChangeAspect="1"/>
+                    </pic:cNvPicPr>
+                  </pic:nvPicPr>
+                  <pic:blipFill>
+                    <a:blip r:embed="rId18"/>
+                    <a:stretch>
+                      <a:fillRect/>
+                    </a:stretch>
+                  </pic:blipFill>
+                  <pic:spPr>
+                    <a:xfrm>
+                      <a:off x="0" y="0"/>
+                      <a:ext cx="6386830" cy="6036945"/>
                     </a:xfrm>
                     <a:prstGeom prst="rect">
                       <a:avLst/>

</xml_diff>